<commit_message>
Clarify scope language and add graduate methods training
Make the experience, skills, and summary lines name the specific work more
precisely, and surface statistical methods training that was not previously
listed anywhere on the site.

- The Safety National bullet now describes running, adjusting, and validating
  established XGBoost models
- "Machine Learning" skills group becomes "Modeling & Statistics", grouping
  regression, inference, and experimental design alongside gradient boosting
- Education gains a graduate methods training line: ANOVA, regression,
  meta-analysis, structural equation modeling
- Summary, tagline, and landing page refer to applied statistics

All three outputs regenerate from data/resume.json, so the page, PDF, and
.docx carry the same wording. PDF is still two pages.

Co-Authored-By: Claude Opus 5 <noreply@anthropic.com>
Claude-Session: https://claude.ai/code/session_01WSicKfasXjCYJMBRCYSA52
</commit_message>
<xml_diff>
--- a/assets/Nicholas_Gray_Resume.docx
+++ b/assets/Nicholas_Gray_Resume.docx
@@ -59,7 +59,7 @@
           <w:sz w:val="20"/>
           <w:szCs w:val="20"/>
         </w:rPr>
-        <w:t xml:space="preserve">Data scientist with nearly four years of industry experience in insurance analytics, built on a decade of quantitative research training. Combines a Ph.D. in Cognitive Psychology with hands-on expertise in SQL, Python, and machine learning to turn large, messy data sources into models, reports, and recommendations that stakeholders act on.</w:t>
+        <w:t xml:space="preserve">Data scientist with nearly four years of industry experience in insurance analytics, built on a decade of quantitative research training. Combines a Ph.D. in Cognitive Psychology with hands-on expertise in SQL, Python, and applied statistics to turn large, messy data sources into analyses, reports, and recommendations that stakeholders act on.</w:t>
       </w:r>
     </w:p>
     <w:p>
@@ -117,15 +117,15 @@
           <w:sz w:val="18"/>
           <w:szCs w:val="18"/>
         </w:rPr>
-        <w:t xml:space="preserve">Machine Learning:  </w:t>
-      </w:r>
-      <w:r>
-        <w:rPr>
-          <w:color w:val="263533"/>
-          <w:sz w:val="19"/>
-          <w:szCs w:val="19"/>
-        </w:rPr>
-        <w:t xml:space="preserve">XGBoost &amp; gradient boosting, Regression (linear &amp; logistic), Predictive modeling, Model evaluation</w:t>
+        <w:t xml:space="preserve">Modeling &amp; Statistics:  </w:t>
+      </w:r>
+      <w:r>
+        <w:rPr>
+          <w:color w:val="263533"/>
+          <w:sz w:val="19"/>
+          <w:szCs w:val="19"/>
+        </w:rPr>
+        <w:t xml:space="preserve">Regression (linear &amp; logistic), XGBoost &amp; gradient boosting (applied), Statistical inference, Experimental design, Model evaluation</w:t>
       </w:r>
     </w:p>
     <w:p>
@@ -148,7 +148,7 @@
           <w:sz w:val="19"/>
           <w:szCs w:val="19"/>
         </w:rPr>
-        <w:t xml:space="preserve">ETL &amp; data cleaning, Exploratory data analysis, Statistical inference, Experimental design, Survey &amp; qualitative analysis</w:t>
+        <w:t xml:space="preserve">ETL &amp; data cleaning, Exploratory data analysis, Survey &amp; qualitative analysis</w:t>
       </w:r>
     </w:p>
     <w:p>
@@ -286,7 +286,7 @@
           <w:sz w:val="19"/>
           <w:szCs w:val="19"/>
         </w:rPr>
-        <w:t xml:space="preserve">Develop machine-learning models — including XGBoost — that produce business-relevant predictions for underwriting and claims questions.</w:t>
+        <w:t xml:space="preserve">Run and adjust established XGBoost models, validating output and interpreting predictions for underwriting and claims questions.</w:t>
       </w:r>
     </w:p>
     <w:p>
@@ -817,7 +817,29 @@
     </w:p>
     <w:p>
       <w:pPr>
-        <w:spacing w:before="90" w:after="40"/>
+        <w:spacing w:before="90" w:after="30"/>
+      </w:pPr>
+      <w:r>
+        <w:rPr>
+          <w:b/>
+          <w:color w:val="0D7361"/>
+          <w:sz w:val="18"/>
+          <w:szCs w:val="18"/>
+        </w:rPr>
+        <w:t xml:space="preserve">Graduate methods training:  </w:t>
+      </w:r>
+      <w:r>
+        <w:rPr>
+          <w:color w:val="3D4D4A"/>
+          <w:sz w:val="19"/>
+          <w:szCs w:val="19"/>
+        </w:rPr>
+        <w:t xml:space="preserve">ANOVA, regression, meta-analysis, structural equation modeling</w:t>
+      </w:r>
+    </w:p>
+    <w:p>
+      <w:pPr>
+        <w:spacing w:before="0" w:after="40"/>
       </w:pPr>
       <w:r>
         <w:rPr>

</xml_diff>